<commit_message>
2026-07-15 21:47 IDT - feat: implement Stage 5 with Structured Output and Pydantic models for robust routing
</commit_message>
<xml_diff>
--- a/assignment_part_2/tests_3.docx
+++ b/assignment_part_2/tests_3.docx
@@ -33,30 +33,24 @@
       </w:pPr>
       <w:r>
         <w:rPr>
-          <w:sz w:val="24"/>
-          <w:szCs w:val="24"/>
-        </w:rPr>
-        <w:t>The diagram created at the code (That shows the agent flow :)</w:t>
-      </w:r>
-    </w:p>
-    <w:p>
-      <w:pPr>
-        <w:bidi w:val="0"/>
-        <w:rPr>
-          <w:sz w:val="24"/>
-          <w:szCs w:val="24"/>
-        </w:rPr>
-      </w:pPr>
-      <w:r>
-        <w:rPr>
-          <w:sz w:val="24"/>
-          <w:szCs w:val="24"/>
+          <w:b/>
+          <w:bCs/>
+          <w:sz w:val="40"/>
+          <w:szCs w:val="40"/>
         </w:rPr>
         <w:drawing>
-          <wp:inline distT="0" distB="0" distL="0" distR="0" wp14:anchorId="71F8BFA0" wp14:editId="6EDC4679">
-            <wp:extent cx="4991100" cy="2514600"/>
-            <wp:effectExtent l="0" t="0" r="0" b="0"/>
-            <wp:docPr id="1529433597" name="תמונה 1"/>
+          <wp:anchor distT="0" distB="0" distL="114300" distR="114300" simplePos="0" relativeHeight="251658240" behindDoc="1" locked="0" layoutInCell="1" allowOverlap="1" wp14:anchorId="33C1C72C" wp14:editId="6BA4D602">
+            <wp:simplePos x="0" y="0"/>
+            <wp:positionH relativeFrom="column">
+              <wp:posOffset>1671320</wp:posOffset>
+            </wp:positionH>
+            <wp:positionV relativeFrom="paragraph">
+              <wp:posOffset>421806</wp:posOffset>
+            </wp:positionV>
+            <wp:extent cx="1781175" cy="4114800"/>
+            <wp:effectExtent l="190500" t="171450" r="161925" b="190500"/>
+            <wp:wrapTopAndBottom/>
+            <wp:docPr id="2074819017" name="תמונה 1"/>
             <wp:cNvGraphicFramePr>
               <a:graphicFrameLocks xmlns:a="http://schemas.openxmlformats.org/drawingml/2006/main" noChangeAspect="1"/>
             </wp:cNvGraphicFramePr>
@@ -64,11 +58,17 @@
               <a:graphicData uri="http://schemas.openxmlformats.org/drawingml/2006/picture">
                 <pic:pic xmlns:pic="http://schemas.openxmlformats.org/drawingml/2006/picture">
                   <pic:nvPicPr>
-                    <pic:cNvPr id="1529433597" name=""/>
+                    <pic:cNvPr id="2074819017" name=""/>
                     <pic:cNvPicPr/>
                   </pic:nvPicPr>
                   <pic:blipFill>
-                    <a:blip r:embed="rId6"/>
+                    <a:blip r:embed="rId6">
+                      <a:extLst>
+                        <a:ext uri="{28A0092B-C50C-407E-A947-70E740481C1C}">
+                          <a14:useLocalDpi xmlns:a14="http://schemas.microsoft.com/office/drawing/2010/main" val="0"/>
+                        </a:ext>
+                      </a:extLst>
+                    </a:blip>
                     <a:stretch>
                       <a:fillRect/>
                     </a:stretch>
@@ -76,73 +76,53 @@
                   <pic:spPr>
                     <a:xfrm>
                       <a:off x="0" y="0"/>
-                      <a:ext cx="4991100" cy="2514600"/>
+                      <a:ext cx="1781175" cy="4114800"/>
                     </a:xfrm>
                     <a:prstGeom prst="rect">
                       <a:avLst/>
                     </a:prstGeom>
+                    <a:solidFill>
+                      <a:srgbClr val="FFFFFF">
+                        <a:shade val="85000"/>
+                      </a:srgbClr>
+                    </a:solidFill>
+                    <a:ln w="190500" cap="rnd">
+                      <a:solidFill>
+                        <a:srgbClr val="FFFFFF"/>
+                      </a:solidFill>
+                    </a:ln>
+                    <a:effectLst>
+                      <a:outerShdw blurRad="50000" algn="tl" rotWithShape="0">
+                        <a:srgbClr val="000000">
+                          <a:alpha val="41000"/>
+                        </a:srgbClr>
+                      </a:outerShdw>
+                    </a:effectLst>
+                    <a:scene3d>
+                      <a:camera prst="orthographicFront"/>
+                      <a:lightRig rig="twoPt" dir="t">
+                        <a:rot lat="0" lon="0" rev="7800000"/>
+                      </a:lightRig>
+                    </a:scene3d>
+                    <a:sp3d contourW="6350">
+                      <a:bevelT w="50800" h="16510"/>
+                      <a:contourClr>
+                        <a:srgbClr val="C0C0C0"/>
+                      </a:contourClr>
+                    </a:sp3d>
                   </pic:spPr>
                 </pic:pic>
               </a:graphicData>
             </a:graphic>
-          </wp:inline>
+          </wp:anchor>
         </w:drawing>
       </w:r>
-    </w:p>
-    <w:p>
-      <w:pPr>
-        <w:bidi w:val="0"/>
-        <w:rPr>
-          <w:i/>
-          <w:iCs/>
-          <w:sz w:val="24"/>
-          <w:szCs w:val="24"/>
-        </w:rPr>
-      </w:pPr>
-      <w:r>
-        <w:rPr>
-          <w:i/>
-          <w:iCs/>
-          <w:sz w:val="24"/>
-          <w:szCs w:val="24"/>
-        </w:rPr>
-        <w:t xml:space="preserve">Note  : </w:t>
-      </w:r>
-      <w:r>
-        <w:rPr>
-          <w:i/>
-          <w:iCs/>
-          <w:sz w:val="24"/>
-          <w:szCs w:val="24"/>
-        </w:rPr>
-        <w:t>It's not Precise because (I guess) the height of the image cut after certain size… so it does not show it right … before the node "_end_" the "StockSelector" / "LLMExplaintion" should be… and then the</w:t>
-      </w:r>
-      <w:r>
-        <w:rPr>
-          <w:i/>
-          <w:iCs/>
-          <w:sz w:val="24"/>
-          <w:szCs w:val="24"/>
-        </w:rPr>
-        <w:t xml:space="preserve"> "</w:t>
-      </w:r>
-      <w:r>
-        <w:rPr>
-          <w:i/>
-          <w:iCs/>
-          <w:sz w:val="24"/>
-          <w:szCs w:val="24"/>
-        </w:rPr>
-        <w:t xml:space="preserve"> _end_ </w:t>
-      </w:r>
-      <w:r>
-        <w:rPr>
-          <w:i/>
-          <w:iCs/>
-          <w:sz w:val="24"/>
-          <w:szCs w:val="24"/>
-        </w:rPr>
-        <w:t>"</w:t>
+      <w:r>
+        <w:rPr>
+          <w:sz w:val="24"/>
+          <w:szCs w:val="24"/>
+        </w:rPr>
+        <w:t>The diagram created at the code (That shows the agent flow :)</w:t>
       </w:r>
     </w:p>
     <w:p>
@@ -176,6 +156,15 @@
         </w:rPr>
         <w:t>Output</w:t>
       </w:r>
+      <w:r>
+        <w:rPr>
+          <w:b/>
+          <w:bCs/>
+          <w:sz w:val="40"/>
+          <w:szCs w:val="40"/>
+        </w:rPr>
+        <w:t>s..</w:t>
+      </w:r>
     </w:p>
     <w:p>
       <w:pPr>
@@ -203,7 +192,7 @@
           <w:sz w:val="32"/>
           <w:szCs w:val="32"/>
         </w:rPr>
-        <w:t>Scenario 1</w:t>
+        <w:t>Scenario 1:</w:t>
       </w:r>
       <w:r>
         <w:rPr>
@@ -212,17 +201,498 @@
           <w:sz w:val="32"/>
           <w:szCs w:val="32"/>
         </w:rPr>
-        <w:t>:</w:t>
-      </w:r>
-      <w:r>
+        <w:t xml:space="preserve"> output at Terminal</w:t>
+      </w:r>
+    </w:p>
+    <w:p>
+      <w:pPr>
+        <w:bidi w:val="0"/>
+        <w:rPr>
+          <w:sz w:val="24"/>
+          <w:szCs w:val="24"/>
+        </w:rPr>
+      </w:pPr>
+      <w:r>
+        <w:rPr>
+          <w:sz w:val="24"/>
+          <w:szCs w:val="24"/>
+        </w:rPr>
+        <w:t>=== Starting LangGraph RAG Investment Agent (Stage 3) ===</w:t>
+      </w:r>
+    </w:p>
+    <w:p>
+      <w:pPr>
+        <w:bidi w:val="0"/>
+        <w:rPr>
+          <w:sz w:val="24"/>
+          <w:szCs w:val="24"/>
+        </w:rPr>
+      </w:pPr>
+      <w:r>
+        <w:rPr>
+          <w:sz w:val="24"/>
+          <w:szCs w:val="24"/>
+        </w:rPr>
+        <w:t>[V] Success: Agent diagram saved to 'agents_plots/agent_s3.png'</w:t>
+      </w:r>
+    </w:p>
+    <w:p>
+      <w:pPr>
+        <w:bidi w:val="0"/>
+        <w:rPr>
+          <w:sz w:val="24"/>
+          <w:szCs w:val="24"/>
+          <w:rtl/>
+        </w:rPr>
+      </w:pPr>
+    </w:p>
+    <w:p>
+      <w:pPr>
+        <w:bidi w:val="0"/>
+        <w:rPr>
+          <w:sz w:val="24"/>
+          <w:szCs w:val="24"/>
+        </w:rPr>
+      </w:pPr>
+      <w:r>
+        <w:rPr>
+          <w:sz w:val="24"/>
+          <w:szCs w:val="24"/>
+        </w:rPr>
+        <w:t>--- [Node] Preference Collector ---</w:t>
+      </w:r>
+    </w:p>
+    <w:p>
+      <w:pPr>
+        <w:bidi w:val="0"/>
+        <w:rPr>
+          <w:sz w:val="24"/>
+          <w:szCs w:val="24"/>
+        </w:rPr>
+      </w:pPr>
+      <w:r>
+        <w:rPr>
+          <w:sz w:val="24"/>
+          <w:szCs w:val="24"/>
+        </w:rPr>
+        <w:t>Enter preferred investment domain (e.g., tech, health): tech</w:t>
+      </w:r>
+    </w:p>
+    <w:p>
+      <w:pPr>
+        <w:bidi w:val="0"/>
+        <w:rPr>
+          <w:sz w:val="24"/>
+          <w:szCs w:val="24"/>
+        </w:rPr>
+      </w:pPr>
+      <w:r>
+        <w:rPr>
+          <w:sz w:val="24"/>
+          <w:szCs w:val="24"/>
+        </w:rPr>
+        <w:t>Enter desired risk level (low, medium, high): medium</w:t>
+      </w:r>
+    </w:p>
+    <w:p>
+      <w:pPr>
+        <w:bidi w:val="0"/>
+        <w:rPr>
+          <w:sz w:val="24"/>
+          <w:szCs w:val="24"/>
+        </w:rPr>
+      </w:pPr>
+      <w:r>
+        <w:rPr>
+          <w:sz w:val="24"/>
+          <w:szCs w:val="24"/>
+        </w:rPr>
+        <w:t>Enter investment horizon (Short-term, Long-term): long (5y+)</w:t>
+      </w:r>
+    </w:p>
+    <w:p>
+      <w:pPr>
+        <w:bidi w:val="0"/>
+        <w:rPr>
+          <w:sz w:val="24"/>
+          <w:szCs w:val="24"/>
+          <w:rtl/>
+        </w:rPr>
+      </w:pPr>
+    </w:p>
+    <w:p>
+      <w:pPr>
+        <w:bidi w:val="0"/>
+        <w:rPr>
+          <w:sz w:val="24"/>
+          <w:szCs w:val="24"/>
+        </w:rPr>
+      </w:pPr>
+      <w:r>
+        <w:rPr>
+          <w:sz w:val="24"/>
+          <w:szCs w:val="24"/>
+        </w:rPr>
+        <w:t>[V] Preferences collected successfully.</w:t>
+      </w:r>
+    </w:p>
+    <w:p>
+      <w:pPr>
+        <w:bidi w:val="0"/>
+        <w:rPr>
+          <w:sz w:val="24"/>
+          <w:szCs w:val="24"/>
+          <w:rtl/>
+        </w:rPr>
+      </w:pPr>
+    </w:p>
+    <w:p>
+      <w:pPr>
+        <w:bidi w:val="0"/>
+        <w:rPr>
+          <w:sz w:val="24"/>
+          <w:szCs w:val="24"/>
+        </w:rPr>
+      </w:pPr>
+      <w:r>
+        <w:rPr>
+          <w:sz w:val="24"/>
+          <w:szCs w:val="24"/>
+        </w:rPr>
+        <w:t>--- [Node] Stock Selector (Semantic RAG Mode) ---</w:t>
+      </w:r>
+    </w:p>
+    <w:p>
+      <w:pPr>
+        <w:bidi w:val="0"/>
+        <w:rPr>
+          <w:sz w:val="24"/>
+          <w:szCs w:val="24"/>
+        </w:rPr>
+      </w:pPr>
+      <w:r>
+        <w:rPr>
+          <w:sz w:val="24"/>
+          <w:szCs w:val="24"/>
+        </w:rPr>
+        <w:t>[DEBUG] Assembled Semantic Search Query: 'domain: tech, risk level: medium, horizon: long (5y+)'</w:t>
+      </w:r>
+    </w:p>
+    <w:p>
+      <w:pPr>
+        <w:bidi w:val="0"/>
+        <w:rPr>
+          <w:sz w:val="24"/>
+          <w:szCs w:val="24"/>
+          <w:rtl/>
+        </w:rPr>
+      </w:pPr>
+    </w:p>
+    <w:p>
+      <w:pPr>
+        <w:bidi w:val="0"/>
+        <w:rPr>
+          <w:sz w:val="24"/>
+          <w:szCs w:val="24"/>
+        </w:rPr>
+      </w:pPr>
+      <w:r>
+        <w:rPr>
+          <w:sz w:val="24"/>
+          <w:szCs w:val="24"/>
+        </w:rPr>
+        <w:t>--- DEBUG: Retrieved Chunks From Chroma DB ---</w:t>
+      </w:r>
+    </w:p>
+    <w:p>
+      <w:pPr>
+        <w:bidi w:val="0"/>
+        <w:rPr>
+          <w:sz w:val="24"/>
+          <w:szCs w:val="24"/>
+        </w:rPr>
+      </w:pPr>
+      <w:r>
+        <w:rPr>
+          <w:sz w:val="24"/>
+          <w:szCs w:val="24"/>
+        </w:rPr>
+        <w:t xml:space="preserve"> Chunk 1 [PLTR]: ## PLTR - **Domain:** Tech - **Risk level:** medium - **Outlook:** Growing enterprise and government AI adoption. - **Ke...</w:t>
+      </w:r>
+    </w:p>
+    <w:p>
+      <w:pPr>
+        <w:bidi w:val="0"/>
+        <w:rPr>
+          <w:sz w:val="24"/>
+          <w:szCs w:val="24"/>
+        </w:rPr>
+      </w:pPr>
+      <w:r>
+        <w:rPr>
+          <w:sz w:val="24"/>
+          <w:szCs w:val="24"/>
+        </w:rPr>
+        <w:t xml:space="preserve"> Chunk 2 [NVDA]: ## NVDA - **Domain:** Tech - **Risk level:** medium - **Outlook:** Strong AI demand and leadership in data-center GPUs. ...</w:t>
+      </w:r>
+    </w:p>
+    <w:p>
+      <w:pPr>
+        <w:bidi w:val="0"/>
+        <w:rPr>
+          <w:sz w:val="24"/>
+          <w:szCs w:val="24"/>
+        </w:rPr>
+      </w:pPr>
+      <w:r>
+        <w:rPr>
+          <w:sz w:val="24"/>
+          <w:szCs w:val="24"/>
+        </w:rPr>
+        <w:t xml:space="preserve"> Chunk 3 [SMCI]: ## SMCI - **Domain:** Tech - **Risk level:** high - **Outlook:** Rapid growth driven by AI server demand. - **Key risks:...</w:t>
+      </w:r>
+    </w:p>
+    <w:p>
+      <w:pPr>
+        <w:bidi w:val="0"/>
+        <w:rPr>
+          <w:sz w:val="24"/>
+          <w:szCs w:val="24"/>
+        </w:rPr>
+      </w:pPr>
+      <w:r>
+        <w:rPr>
+          <w:sz w:val="24"/>
+          <w:szCs w:val="24"/>
+        </w:rPr>
+        <w:t xml:space="preserve"> Chunk 4 [MSFT]: ## MSFT - **Domain:** Tech - **Risk level:** low - **Outlook:** Cloud dominance and rapid AI integration across products...</w:t>
+      </w:r>
+    </w:p>
+    <w:p>
+      <w:pPr>
+        <w:bidi w:val="0"/>
+        <w:rPr>
+          <w:sz w:val="24"/>
+          <w:szCs w:val="24"/>
+          <w:rtl/>
+        </w:rPr>
+      </w:pPr>
+    </w:p>
+    <w:p>
+      <w:pPr>
+        <w:bidi w:val="0"/>
+        <w:rPr>
+          <w:sz w:val="24"/>
+          <w:szCs w:val="24"/>
+        </w:rPr>
+      </w:pPr>
+      <w:r>
+        <w:rPr>
+          <w:sz w:val="24"/>
+          <w:szCs w:val="24"/>
+        </w:rPr>
+        <w:t>--- [Node] LLM Explanation (Grounded Generation) ---</w:t>
+      </w:r>
+    </w:p>
+    <w:p>
+      <w:pPr>
+        <w:bidi w:val="0"/>
+        <w:rPr>
+          <w:sz w:val="24"/>
+          <w:szCs w:val="24"/>
+          <w:rtl/>
+        </w:rPr>
+      </w:pPr>
+    </w:p>
+    <w:p>
+      <w:pPr>
+        <w:bidi w:val="0"/>
+        <w:rPr>
+          <w:sz w:val="24"/>
+          <w:szCs w:val="24"/>
+          <w:rtl/>
+        </w:rPr>
+      </w:pPr>
+      <w:r>
+        <w:rPr>
+          <w:sz w:val="24"/>
+          <w:szCs w:val="24"/>
+        </w:rPr>
+        <w:t>==============================================</w:t>
+      </w:r>
+    </w:p>
+    <w:p>
+      <w:pPr>
+        <w:bidi w:val="0"/>
+        <w:rPr>
+          <w:sz w:val="24"/>
+          <w:szCs w:val="24"/>
+        </w:rPr>
+      </w:pPr>
+      <w:r>
+        <w:rPr>
+          <w:sz w:val="24"/>
+          <w:szCs w:val="24"/>
+        </w:rPr>
+        <w:t xml:space="preserve">               FINAL REPORT                   </w:t>
+      </w:r>
+    </w:p>
+    <w:p>
+      <w:pPr>
+        <w:bidi w:val="0"/>
+        <w:rPr>
+          <w:sz w:val="24"/>
+          <w:szCs w:val="24"/>
+          <w:rtl/>
+        </w:rPr>
+      </w:pPr>
+      <w:r>
+        <w:rPr>
+          <w:sz w:val="24"/>
+          <w:szCs w:val="24"/>
+        </w:rPr>
+        <w:t>==============================================</w:t>
+      </w:r>
+    </w:p>
+    <w:p>
+      <w:pPr>
+        <w:bidi w:val="0"/>
+        <w:rPr>
+          <w:sz w:val="24"/>
+          <w:szCs w:val="24"/>
+        </w:rPr>
+      </w:pPr>
+      <w:r>
+        <w:rPr>
+          <w:sz w:val="24"/>
+          <w:szCs w:val="24"/>
+        </w:rPr>
+        <w:t>Hello! Based on your preferences for the tech domain, a medium risk level, and a long-term investment horizon (5 years or more), here are some potential stock considerations from the information provided.</w:t>
+      </w:r>
+    </w:p>
+    <w:p>
+      <w:pPr>
+        <w:bidi w:val="0"/>
+        <w:rPr>
+          <w:sz w:val="24"/>
+          <w:szCs w:val="24"/>
+          <w:rtl/>
+        </w:rPr>
+      </w:pPr>
+    </w:p>
+    <w:p>
+      <w:pPr>
+        <w:bidi w:val="0"/>
+        <w:rPr>
+          <w:sz w:val="24"/>
+          <w:szCs w:val="24"/>
+        </w:rPr>
+      </w:pPr>
+      <w:r>
+        <w:rPr>
+          <w:sz w:val="24"/>
+          <w:szCs w:val="24"/>
+        </w:rPr>
+        <w:t>### Suggested Stocks:</w:t>
+      </w:r>
+    </w:p>
+    <w:p>
+      <w:pPr>
+        <w:bidi w:val="0"/>
+        <w:rPr>
+          <w:sz w:val="24"/>
+          <w:szCs w:val="24"/>
+          <w:rtl/>
+        </w:rPr>
+      </w:pPr>
+    </w:p>
+    <w:p>
+      <w:pPr>
+        <w:bidi w:val="0"/>
+        <w:rPr>
+          <w:sz w:val="24"/>
+          <w:szCs w:val="24"/>
+        </w:rPr>
+      </w:pPr>
+      <w:r>
+        <w:rPr>
+          <w:sz w:val="24"/>
+          <w:szCs w:val="24"/>
+        </w:rPr>
+        <w:t>*   **PLTR (Palantir Technologies)**</w:t>
+      </w:r>
+    </w:p>
+    <w:p>
+      <w:pPr>
+        <w:bidi w:val="0"/>
+        <w:rPr>
+          <w:sz w:val="24"/>
+          <w:szCs w:val="24"/>
+        </w:rPr>
+      </w:pPr>
+      <w:r>
+        <w:rPr>
+          <w:sz w:val="24"/>
+          <w:szCs w:val="24"/>
+        </w:rPr>
+        <w:t xml:space="preserve">    *   Palantir operates within the tech domain and aligns with a medium risk level. Its outlook is characterized by growing enterprise and government AI adoption, which suggests long-term growth potential as these sectors increasingly integrate AI solutions.</w:t>
+      </w:r>
+    </w:p>
+    <w:p>
+      <w:pPr>
+        <w:bidi w:val="0"/>
+        <w:rPr>
+          <w:sz w:val="24"/>
+          <w:szCs w:val="24"/>
+        </w:rPr>
+      </w:pPr>
+      <w:r>
+        <w:rPr>
+          <w:sz w:val="24"/>
+          <w:szCs w:val="24"/>
+        </w:rPr>
+        <w:lastRenderedPageBreak/>
+        <w:t>*   **NVDA (NVIDIA Corporation)**</w:t>
+      </w:r>
+    </w:p>
+    <w:p>
+      <w:pPr>
+        <w:pBdr>
+          <w:bottom w:val="double" w:sz="6" w:space="1" w:color="auto"/>
+        </w:pBdr>
+        <w:bidi w:val="0"/>
+        <w:rPr>
+          <w:sz w:val="24"/>
+          <w:szCs w:val="24"/>
+        </w:rPr>
+      </w:pPr>
+      <w:r>
+        <w:rPr>
+          <w:sz w:val="24"/>
+          <w:szCs w:val="24"/>
+        </w:rPr>
+        <w:t xml:space="preserve">    *   NVIDIA is a key player in the tech domain, also categorized with a medium risk level. The company benefits from strong AI demand and holds a leadership position in data-center GPUs, indicating sustained relevance and growth in the evolving AI landscape.</w:t>
+      </w:r>
+    </w:p>
+    <w:p>
+      <w:pPr>
+        <w:bidi w:val="0"/>
+        <w:rPr>
+          <w:sz w:val="24"/>
+          <w:szCs w:val="24"/>
+        </w:rPr>
+      </w:pPr>
+    </w:p>
+    <w:p>
+      <w:pPr>
+        <w:bidi w:val="0"/>
         <w:rPr>
           <w:b/>
           <w:bCs/>
           <w:sz w:val="32"/>
           <w:szCs w:val="32"/>
         </w:rPr>
-        <w:t xml:space="preserve"> </w:t>
-      </w:r>
+      </w:pPr>
       <w:r>
         <w:rPr>
           <w:b/>
@@ -230,514 +700,15 @@
           <w:sz w:val="32"/>
           <w:szCs w:val="32"/>
         </w:rPr>
-        <w:t>output at Terminal</w:t>
-      </w:r>
-    </w:p>
-    <w:p>
-      <w:pPr>
-        <w:bidi w:val="0"/>
-        <w:rPr>
-          <w:sz w:val="24"/>
-          <w:szCs w:val="24"/>
-        </w:rPr>
-      </w:pPr>
-      <w:r>
-        <w:rPr>
-          <w:sz w:val="24"/>
-          <w:szCs w:val="24"/>
-        </w:rPr>
-        <w:t>=== Starting LangGraph RAG Investment Agent (Stage 3) ===</w:t>
-      </w:r>
-    </w:p>
-    <w:p>
-      <w:pPr>
-        <w:bidi w:val="0"/>
-        <w:rPr>
-          <w:sz w:val="24"/>
-          <w:szCs w:val="24"/>
-        </w:rPr>
-      </w:pPr>
-      <w:r>
-        <w:rPr>
-          <w:sz w:val="24"/>
-          <w:szCs w:val="24"/>
-        </w:rPr>
-        <w:t>[V] Success: Agent diagram saved to 'agents_plots/agent_s3.png'</w:t>
-      </w:r>
-    </w:p>
-    <w:p>
-      <w:pPr>
-        <w:bidi w:val="0"/>
-        <w:rPr>
-          <w:sz w:val="24"/>
-          <w:szCs w:val="24"/>
-          <w:rtl/>
-        </w:rPr>
-      </w:pPr>
-    </w:p>
-    <w:p>
-      <w:pPr>
-        <w:bidi w:val="0"/>
-        <w:rPr>
-          <w:sz w:val="24"/>
-          <w:szCs w:val="24"/>
-        </w:rPr>
-      </w:pPr>
-      <w:r>
-        <w:rPr>
-          <w:sz w:val="24"/>
-          <w:szCs w:val="24"/>
-        </w:rPr>
-        <w:t>--- [Node] Preference Collector ---</w:t>
-      </w:r>
-    </w:p>
-    <w:p>
-      <w:pPr>
-        <w:bidi w:val="0"/>
-        <w:rPr>
-          <w:sz w:val="24"/>
-          <w:szCs w:val="24"/>
-        </w:rPr>
-      </w:pPr>
-      <w:r>
-        <w:rPr>
-          <w:sz w:val="24"/>
-          <w:szCs w:val="24"/>
-        </w:rPr>
-        <w:t>Enter preferred investment domain (e.g., tech, health): tech</w:t>
-      </w:r>
-    </w:p>
-    <w:p>
-      <w:pPr>
-        <w:bidi w:val="0"/>
-        <w:rPr>
-          <w:sz w:val="24"/>
-          <w:szCs w:val="24"/>
-        </w:rPr>
-      </w:pPr>
-      <w:r>
-        <w:rPr>
-          <w:sz w:val="24"/>
-          <w:szCs w:val="24"/>
-        </w:rPr>
-        <w:t>Enter desired risk level (low, medium, high): medium</w:t>
-      </w:r>
-    </w:p>
-    <w:p>
-      <w:pPr>
-        <w:bidi w:val="0"/>
-        <w:rPr>
-          <w:sz w:val="24"/>
-          <w:szCs w:val="24"/>
-        </w:rPr>
-      </w:pPr>
-      <w:r>
-        <w:rPr>
-          <w:sz w:val="24"/>
-          <w:szCs w:val="24"/>
-        </w:rPr>
-        <w:t>Enter investment horizon (Short-term, Long-term): long (5y+)</w:t>
-      </w:r>
-    </w:p>
-    <w:p>
-      <w:pPr>
-        <w:bidi w:val="0"/>
-        <w:rPr>
-          <w:sz w:val="24"/>
-          <w:szCs w:val="24"/>
-          <w:rtl/>
-        </w:rPr>
-      </w:pPr>
-    </w:p>
-    <w:p>
-      <w:pPr>
-        <w:bidi w:val="0"/>
-        <w:rPr>
-          <w:sz w:val="24"/>
-          <w:szCs w:val="24"/>
-        </w:rPr>
-      </w:pPr>
-      <w:r>
-        <w:rPr>
-          <w:sz w:val="24"/>
-          <w:szCs w:val="24"/>
-        </w:rPr>
-        <w:t>[V] Preferences collected successfully.</w:t>
-      </w:r>
-    </w:p>
-    <w:p>
-      <w:pPr>
-        <w:bidi w:val="0"/>
-        <w:rPr>
-          <w:sz w:val="24"/>
-          <w:szCs w:val="24"/>
-          <w:rtl/>
-        </w:rPr>
-      </w:pPr>
-    </w:p>
-    <w:p>
-      <w:pPr>
-        <w:bidi w:val="0"/>
-        <w:rPr>
-          <w:sz w:val="24"/>
-          <w:szCs w:val="24"/>
-        </w:rPr>
-      </w:pPr>
-      <w:r>
-        <w:rPr>
-          <w:sz w:val="24"/>
-          <w:szCs w:val="24"/>
-        </w:rPr>
-        <w:t>--- [Node] Stock Selector (Semantic RAG Mode) ---</w:t>
-      </w:r>
-    </w:p>
-    <w:p>
-      <w:pPr>
-        <w:bidi w:val="0"/>
-        <w:rPr>
-          <w:sz w:val="24"/>
-          <w:szCs w:val="24"/>
-        </w:rPr>
-      </w:pPr>
-      <w:r>
-        <w:rPr>
-          <w:sz w:val="24"/>
-          <w:szCs w:val="24"/>
-        </w:rPr>
-        <w:lastRenderedPageBreak/>
-        <w:t>[DEBUG] Assembled Semantic Search Query: 'domain: tech, risk level: medium, horizon: long (5y+)'</w:t>
-      </w:r>
-    </w:p>
-    <w:p>
-      <w:pPr>
-        <w:bidi w:val="0"/>
-        <w:rPr>
-          <w:sz w:val="24"/>
-          <w:szCs w:val="24"/>
-          <w:rtl/>
-        </w:rPr>
-      </w:pPr>
-    </w:p>
-    <w:p>
-      <w:pPr>
-        <w:bidi w:val="0"/>
-        <w:rPr>
-          <w:sz w:val="24"/>
-          <w:szCs w:val="24"/>
-        </w:rPr>
-      </w:pPr>
-      <w:r>
-        <w:rPr>
-          <w:sz w:val="24"/>
-          <w:szCs w:val="24"/>
-        </w:rPr>
-        <w:t>--- DEBUG: Retrieved Chunks From Chroma DB ---</w:t>
-      </w:r>
-    </w:p>
-    <w:p>
-      <w:pPr>
-        <w:bidi w:val="0"/>
-        <w:rPr>
-          <w:sz w:val="24"/>
-          <w:szCs w:val="24"/>
-        </w:rPr>
-      </w:pPr>
-      <w:r>
-        <w:rPr>
-          <w:sz w:val="24"/>
-          <w:szCs w:val="24"/>
-        </w:rPr>
-        <w:t xml:space="preserve"> Chunk 1 [PLTR]: ## PLTR - **Domain:** Tech - **Risk level:** medium - **Outlook:** Growing enterprise and government AI adoption. - **Ke...</w:t>
-      </w:r>
-    </w:p>
-    <w:p>
-      <w:pPr>
-        <w:bidi w:val="0"/>
-        <w:rPr>
-          <w:sz w:val="24"/>
-          <w:szCs w:val="24"/>
-        </w:rPr>
-      </w:pPr>
-      <w:r>
-        <w:rPr>
-          <w:sz w:val="24"/>
-          <w:szCs w:val="24"/>
-        </w:rPr>
-        <w:t xml:space="preserve"> Chunk 2 [NVDA]: ## NVDA - **Domain:** Tech - **Risk level:** medium - **Outlook:** Strong AI demand and leadership in data-center GPUs. ...</w:t>
-      </w:r>
-    </w:p>
-    <w:p>
-      <w:pPr>
-        <w:bidi w:val="0"/>
-        <w:rPr>
-          <w:sz w:val="24"/>
-          <w:szCs w:val="24"/>
-        </w:rPr>
-      </w:pPr>
-      <w:r>
-        <w:rPr>
-          <w:sz w:val="24"/>
-          <w:szCs w:val="24"/>
-        </w:rPr>
-        <w:t xml:space="preserve"> Chunk 3 [SMCI]: ## SMCI - **Domain:** Tech - **Risk level:** high - **Outlook:** Rapid growth driven by AI server demand. - **Key risks:...</w:t>
-      </w:r>
-    </w:p>
-    <w:p>
-      <w:pPr>
-        <w:bidi w:val="0"/>
-        <w:rPr>
-          <w:sz w:val="24"/>
-          <w:szCs w:val="24"/>
-        </w:rPr>
-      </w:pPr>
-      <w:r>
-        <w:rPr>
-          <w:sz w:val="24"/>
-          <w:szCs w:val="24"/>
-        </w:rPr>
-        <w:t xml:space="preserve"> Chunk 4 [MSFT]: ## MSFT - **Domain:** Tech - **Risk level:** low - **Outlook:** Cloud dominance and rapid AI integration across products...</w:t>
-      </w:r>
-    </w:p>
-    <w:p>
-      <w:pPr>
-        <w:bidi w:val="0"/>
-        <w:rPr>
-          <w:sz w:val="24"/>
-          <w:szCs w:val="24"/>
-          <w:rtl/>
-        </w:rPr>
-      </w:pPr>
-    </w:p>
-    <w:p>
-      <w:pPr>
-        <w:bidi w:val="0"/>
-        <w:rPr>
-          <w:sz w:val="24"/>
-          <w:szCs w:val="24"/>
-        </w:rPr>
-      </w:pPr>
-      <w:r>
-        <w:rPr>
-          <w:sz w:val="24"/>
-          <w:szCs w:val="24"/>
-        </w:rPr>
-        <w:t>--- [Node] LLM Explanation (Grounded Generation) ---</w:t>
-      </w:r>
-    </w:p>
-    <w:p>
-      <w:pPr>
-        <w:bidi w:val="0"/>
-        <w:rPr>
-          <w:sz w:val="24"/>
-          <w:szCs w:val="24"/>
-          <w:rtl/>
-        </w:rPr>
-      </w:pPr>
-    </w:p>
-    <w:p>
-      <w:pPr>
-        <w:bidi w:val="0"/>
-        <w:rPr>
-          <w:sz w:val="24"/>
-          <w:szCs w:val="24"/>
-          <w:rtl/>
-        </w:rPr>
-      </w:pPr>
-      <w:r>
-        <w:rPr>
-          <w:sz w:val="24"/>
-          <w:szCs w:val="24"/>
-        </w:rPr>
-        <w:t>==============================================</w:t>
-      </w:r>
-    </w:p>
-    <w:p>
-      <w:pPr>
-        <w:bidi w:val="0"/>
-        <w:rPr>
-          <w:sz w:val="24"/>
-          <w:szCs w:val="24"/>
-        </w:rPr>
-      </w:pPr>
-      <w:r>
-        <w:rPr>
-          <w:sz w:val="24"/>
-          <w:szCs w:val="24"/>
-        </w:rPr>
-        <w:t xml:space="preserve">               FINAL REPORT                   </w:t>
-      </w:r>
-    </w:p>
-    <w:p>
-      <w:pPr>
-        <w:bidi w:val="0"/>
-        <w:rPr>
-          <w:sz w:val="24"/>
-          <w:szCs w:val="24"/>
-          <w:rtl/>
-        </w:rPr>
-      </w:pPr>
-      <w:r>
-        <w:rPr>
-          <w:sz w:val="24"/>
-          <w:szCs w:val="24"/>
-        </w:rPr>
-        <w:t>==============================================</w:t>
-      </w:r>
-    </w:p>
-    <w:p>
-      <w:pPr>
-        <w:bidi w:val="0"/>
-        <w:rPr>
-          <w:sz w:val="24"/>
-          <w:szCs w:val="24"/>
-        </w:rPr>
-      </w:pPr>
-      <w:r>
-        <w:rPr>
-          <w:sz w:val="24"/>
-          <w:szCs w:val="24"/>
-        </w:rPr>
-        <w:t>Hello! Based on your preferences for the tech domain, a medium risk level, and a long-term investment horizon (5 years or more), here are some potential stock considerations from the information provided.</w:t>
-      </w:r>
-    </w:p>
-    <w:p>
-      <w:pPr>
-        <w:bidi w:val="0"/>
-        <w:rPr>
-          <w:sz w:val="24"/>
-          <w:szCs w:val="24"/>
-          <w:rtl/>
-        </w:rPr>
-      </w:pPr>
-    </w:p>
-    <w:p>
-      <w:pPr>
-        <w:bidi w:val="0"/>
-        <w:rPr>
-          <w:sz w:val="24"/>
-          <w:szCs w:val="24"/>
-        </w:rPr>
-      </w:pPr>
-      <w:r>
-        <w:rPr>
-          <w:sz w:val="24"/>
-          <w:szCs w:val="24"/>
-        </w:rPr>
-        <w:t>### Suggested Stocks:</w:t>
-      </w:r>
-    </w:p>
-    <w:p>
-      <w:pPr>
-        <w:bidi w:val="0"/>
-        <w:rPr>
-          <w:sz w:val="24"/>
-          <w:szCs w:val="24"/>
-          <w:rtl/>
-        </w:rPr>
-      </w:pPr>
-    </w:p>
-    <w:p>
-      <w:pPr>
-        <w:bidi w:val="0"/>
-        <w:rPr>
-          <w:sz w:val="24"/>
-          <w:szCs w:val="24"/>
-        </w:rPr>
-      </w:pPr>
-      <w:r>
-        <w:rPr>
-          <w:sz w:val="24"/>
-          <w:szCs w:val="24"/>
-        </w:rPr>
-        <w:t>*   **PLTR (Palantir Technologies)**</w:t>
-      </w:r>
-    </w:p>
-    <w:p>
-      <w:pPr>
-        <w:bidi w:val="0"/>
-        <w:rPr>
-          <w:sz w:val="24"/>
-          <w:szCs w:val="24"/>
-        </w:rPr>
-      </w:pPr>
-      <w:r>
-        <w:rPr>
-          <w:sz w:val="24"/>
-          <w:szCs w:val="24"/>
-        </w:rPr>
-        <w:t xml:space="preserve">    *   Palantir operates within the tech domain and aligns with a medium risk level. Its outlook is characterized by growing enterprise and government AI adoption, which suggests long-term growth potential as these sectors increasingly integrate AI solutions.</w:t>
-      </w:r>
-    </w:p>
-    <w:p>
-      <w:pPr>
-        <w:bidi w:val="0"/>
-        <w:rPr>
-          <w:sz w:val="24"/>
-          <w:szCs w:val="24"/>
-        </w:rPr>
-      </w:pPr>
-      <w:r>
-        <w:rPr>
-          <w:sz w:val="24"/>
-          <w:szCs w:val="24"/>
-        </w:rPr>
-        <w:t>*   **NVDA (NVIDIA Corporation)**</w:t>
-      </w:r>
-    </w:p>
-    <w:p>
-      <w:pPr>
-        <w:pBdr>
-          <w:bottom w:val="double" w:sz="6" w:space="1" w:color="auto"/>
-        </w:pBdr>
-        <w:bidi w:val="0"/>
-        <w:rPr>
-          <w:sz w:val="24"/>
-          <w:szCs w:val="24"/>
-        </w:rPr>
-      </w:pPr>
-      <w:r>
-        <w:rPr>
-          <w:sz w:val="24"/>
-          <w:szCs w:val="24"/>
-        </w:rPr>
-        <w:t xml:space="preserve">    *   NVIDIA is a key player in the tech domain, also categorized with a medium risk level. The company benefits from strong AI demand and holds a leadership position in data-center GPUs, indicating sustained relevance and growth in the evolving AI landscape.</w:t>
-      </w:r>
-    </w:p>
-    <w:p>
-      <w:pPr>
-        <w:bidi w:val="0"/>
-        <w:rPr>
-          <w:sz w:val="24"/>
-          <w:szCs w:val="24"/>
-        </w:rPr>
-      </w:pPr>
-    </w:p>
-    <w:p>
-      <w:pPr>
-        <w:bidi w:val="0"/>
+        <w:t>Scenerio 2 :</w:t>
+      </w:r>
+      <w:r>
         <w:rPr>
           <w:b/>
           <w:bCs/>
           <w:sz w:val="32"/>
           <w:szCs w:val="32"/>
         </w:rPr>
-      </w:pPr>
-      <w:r>
-        <w:rPr>
-          <w:b/>
-          <w:bCs/>
-          <w:sz w:val="32"/>
-          <w:szCs w:val="32"/>
-        </w:rPr>
-        <w:t>Scenerio 2 :</w:t>
-      </w:r>
-      <w:r>
-        <w:rPr>
-          <w:b/>
-          <w:bCs/>
-          <w:sz w:val="32"/>
-          <w:szCs w:val="32"/>
-        </w:rPr>
         <w:t xml:space="preserve"> output at Terminal</w:t>
       </w:r>
     </w:p>
@@ -1457,6 +1428,7 @@
           <w:sz w:val="24"/>
           <w:szCs w:val="24"/>
         </w:rPr>
+        <w:lastRenderedPageBreak/>
         <w:t>[DEBUG] Assembled Semantic Search Query: 'domain: health, risk level: high, horizon: medium 2-5y'</w:t>
       </w:r>
     </w:p>
@@ -1499,273 +1471,273 @@
           <w:sz w:val="24"/>
           <w:szCs w:val="24"/>
         </w:rPr>
+        <w:t xml:space="preserve"> Chunk 1 [REGN]: ## REGN - **Domain:** Health - **Risk level:** medium - **Outlook:** Strong biologics portfolio and expanding commercial...</w:t>
+      </w:r>
+    </w:p>
+    <w:p>
+      <w:pPr>
+        <w:bidi w:val="0"/>
+        <w:rPr>
+          <w:sz w:val="24"/>
+          <w:szCs w:val="24"/>
+        </w:rPr>
+      </w:pPr>
+      <w:r>
+        <w:rPr>
+          <w:sz w:val="24"/>
+          <w:szCs w:val="24"/>
+        </w:rPr>
+        <w:t xml:space="preserve"> Chunk 2 [VRTX]: ## VRTX - **Domain:** Health - **Risk level:** medium - **Outlook:** Dominant cystic fibrosis franchise and growing gene...</w:t>
+      </w:r>
+    </w:p>
+    <w:p>
+      <w:pPr>
+        <w:bidi w:val="0"/>
+        <w:rPr>
+          <w:sz w:val="24"/>
+          <w:szCs w:val="24"/>
+        </w:rPr>
+      </w:pPr>
+      <w:r>
+        <w:rPr>
+          <w:sz w:val="24"/>
+          <w:szCs w:val="24"/>
+        </w:rPr>
+        <w:t xml:space="preserve"> Chunk 3 [CRSP]: ## CRSP - **Domain:** Health - **Risk level:** high - **Outlook:** Long-term potential in CRISPR-based therapies. - **Ke...</w:t>
+      </w:r>
+    </w:p>
+    <w:p>
+      <w:pPr>
+        <w:bidi w:val="0"/>
+        <w:rPr>
+          <w:sz w:val="24"/>
+          <w:szCs w:val="24"/>
+        </w:rPr>
+      </w:pPr>
+      <w:r>
+        <w:rPr>
+          <w:sz w:val="24"/>
+          <w:szCs w:val="24"/>
+        </w:rPr>
+        <w:t xml:space="preserve"> Chunk 4 [LLY]: ## LLY - **Domain:** Health - **Risk level:** low - **Outlook:** Leader in diabetes and obesity treatments with strong p...</w:t>
+      </w:r>
+    </w:p>
+    <w:p>
+      <w:pPr>
+        <w:bidi w:val="0"/>
+        <w:rPr>
+          <w:sz w:val="24"/>
+          <w:szCs w:val="24"/>
+          <w:rtl/>
+        </w:rPr>
+      </w:pPr>
+    </w:p>
+    <w:p>
+      <w:pPr>
+        <w:bidi w:val="0"/>
+        <w:rPr>
+          <w:sz w:val="24"/>
+          <w:szCs w:val="24"/>
+        </w:rPr>
+      </w:pPr>
+      <w:r>
+        <w:rPr>
+          <w:sz w:val="24"/>
+          <w:szCs w:val="24"/>
+        </w:rPr>
+        <w:t>--- [Node] LLM Explanation (Grounded Generation) ---</w:t>
+      </w:r>
+    </w:p>
+    <w:p>
+      <w:pPr>
+        <w:bidi w:val="0"/>
+        <w:rPr>
+          <w:sz w:val="24"/>
+          <w:szCs w:val="24"/>
+          <w:rtl/>
+        </w:rPr>
+      </w:pPr>
+    </w:p>
+    <w:p>
+      <w:pPr>
+        <w:bidi w:val="0"/>
+        <w:rPr>
+          <w:sz w:val="24"/>
+          <w:szCs w:val="24"/>
+          <w:rtl/>
+        </w:rPr>
+      </w:pPr>
+      <w:r>
+        <w:rPr>
+          <w:sz w:val="24"/>
+          <w:szCs w:val="24"/>
+        </w:rPr>
+        <w:t>==============================================</w:t>
+      </w:r>
+    </w:p>
+    <w:p>
+      <w:pPr>
+        <w:bidi w:val="0"/>
+        <w:rPr>
+          <w:sz w:val="24"/>
+          <w:szCs w:val="24"/>
+        </w:rPr>
+      </w:pPr>
+      <w:r>
+        <w:rPr>
+          <w:sz w:val="24"/>
+          <w:szCs w:val="24"/>
+        </w:rPr>
+        <w:t xml:space="preserve">               FINAL REPORT                   </w:t>
+      </w:r>
+    </w:p>
+    <w:p>
+      <w:pPr>
+        <w:bidi w:val="0"/>
+        <w:rPr>
+          <w:sz w:val="24"/>
+          <w:szCs w:val="24"/>
+          <w:rtl/>
+        </w:rPr>
+      </w:pPr>
+      <w:r>
+        <w:rPr>
+          <w:sz w:val="24"/>
+          <w:szCs w:val="24"/>
+        </w:rPr>
+        <w:t>==============================================</w:t>
+      </w:r>
+    </w:p>
+    <w:p>
+      <w:pPr>
+        <w:bidi w:val="0"/>
+        <w:rPr>
+          <w:sz w:val="24"/>
+          <w:szCs w:val="24"/>
+        </w:rPr>
+      </w:pPr>
+      <w:r>
+        <w:rPr>
+          <w:sz w:val="24"/>
+          <w:szCs w:val="24"/>
+        </w:rPr>
+        <w:t>Hello! Based on your interest in the health domain with a high-risk tolerance and a medium-term horizon of 2-5 years, I can provide some educational insights from the retrieved information.</w:t>
+      </w:r>
+    </w:p>
+    <w:p>
+      <w:pPr>
+        <w:bidi w:val="0"/>
+        <w:rPr>
+          <w:sz w:val="24"/>
+          <w:szCs w:val="24"/>
+          <w:rtl/>
+        </w:rPr>
+      </w:pPr>
+    </w:p>
+    <w:p>
+      <w:pPr>
+        <w:bidi w:val="0"/>
+        <w:rPr>
+          <w:sz w:val="24"/>
+          <w:szCs w:val="24"/>
+        </w:rPr>
+      </w:pPr>
+      <w:r>
+        <w:rPr>
+          <w:sz w:val="24"/>
+          <w:szCs w:val="24"/>
+        </w:rPr>
+        <w:t>Here is a stock suggestion that aligns with your criteria:</w:t>
+      </w:r>
+    </w:p>
+    <w:p>
+      <w:pPr>
+        <w:bidi w:val="0"/>
+        <w:rPr>
+          <w:sz w:val="24"/>
+          <w:szCs w:val="24"/>
+          <w:rtl/>
+        </w:rPr>
+      </w:pPr>
+    </w:p>
+    <w:p>
+      <w:pPr>
+        <w:bidi w:val="0"/>
+        <w:rPr>
+          <w:sz w:val="24"/>
+          <w:szCs w:val="24"/>
+        </w:rPr>
+      </w:pPr>
+      <w:r>
+        <w:rPr>
+          <w:sz w:val="24"/>
+          <w:szCs w:val="24"/>
+        </w:rPr>
+        <w:t>*   **CRSP**</w:t>
+      </w:r>
+    </w:p>
+    <w:p>
+      <w:pPr>
+        <w:bidi w:val="0"/>
+        <w:rPr>
+          <w:sz w:val="24"/>
+          <w:szCs w:val="24"/>
+        </w:rPr>
+      </w:pPr>
+      <w:r>
+        <w:rPr>
+          <w:sz w:val="24"/>
+          <w:szCs w:val="24"/>
+        </w:rPr>
+        <w:t xml:space="preserve">    CRSP is categorized within the health domain and explicitly noted as having a high risk level, directly matching your preferences. While its outlook highlights "long-term potential" in CRISPR-based therapies, for a high-risk investment in innovative biotechnology, significant developments and market recognition can often occur within a medium 2-5 year investment window. Its key risks, such as clinical uncertainty and a volatile revenue outlook, further reinforce its high-risk profile, aligning with your specified appetite for risk.</w:t>
+      </w:r>
+    </w:p>
+    <w:p>
+      <w:pPr>
+        <w:bidi w:val="0"/>
+        <w:rPr>
+          <w:sz w:val="24"/>
+          <w:szCs w:val="24"/>
+        </w:rPr>
+      </w:pPr>
+      <w:r>
+        <w:rPr>
+          <w:sz w:val="24"/>
+          <w:szCs w:val="24"/>
+        </w:rPr>
+        <w:t>==============================================</w:t>
+      </w:r>
+      <w:r>
+        <w:rPr>
+          <w:sz w:val="24"/>
+          <w:szCs w:val="24"/>
+        </w:rPr>
+        <w:t xml:space="preserve"> </w:t>
+      </w:r>
+    </w:p>
+    <w:p>
+      <w:pPr>
+        <w:bidi w:val="0"/>
+        <w:rPr>
+          <w:sz w:val="24"/>
+          <w:szCs w:val="24"/>
+        </w:rPr>
+      </w:pPr>
+    </w:p>
+    <w:p>
+      <w:pPr>
+        <w:bidi w:val="0"/>
+        <w:rPr>
+          <w:sz w:val="24"/>
+          <w:szCs w:val="24"/>
+        </w:rPr>
+      </w:pPr>
+      <w:r>
+        <w:rPr>
+          <w:sz w:val="24"/>
+          <w:szCs w:val="24"/>
+        </w:rPr>
         <w:lastRenderedPageBreak/>
-        <w:t xml:space="preserve"> Chunk 1 [REGN]: ## REGN - **Domain:** Health - **Risk level:** medium - **Outlook:** Strong biologics portfolio and expanding commercial...</w:t>
-      </w:r>
-    </w:p>
-    <w:p>
-      <w:pPr>
-        <w:bidi w:val="0"/>
-        <w:rPr>
-          <w:sz w:val="24"/>
-          <w:szCs w:val="24"/>
-        </w:rPr>
-      </w:pPr>
-      <w:r>
-        <w:rPr>
-          <w:sz w:val="24"/>
-          <w:szCs w:val="24"/>
-        </w:rPr>
-        <w:t xml:space="preserve"> Chunk 2 [VRTX]: ## VRTX - **Domain:** Health - **Risk level:** medium - **Outlook:** Dominant cystic fibrosis franchise and growing gene...</w:t>
-      </w:r>
-    </w:p>
-    <w:p>
-      <w:pPr>
-        <w:bidi w:val="0"/>
-        <w:rPr>
-          <w:sz w:val="24"/>
-          <w:szCs w:val="24"/>
-        </w:rPr>
-      </w:pPr>
-      <w:r>
-        <w:rPr>
-          <w:sz w:val="24"/>
-          <w:szCs w:val="24"/>
-        </w:rPr>
-        <w:t xml:space="preserve"> Chunk 3 [CRSP]: ## CRSP - **Domain:** Health - **Risk level:** high - **Outlook:** Long-term potential in CRISPR-based therapies. - **Ke...</w:t>
-      </w:r>
-    </w:p>
-    <w:p>
-      <w:pPr>
-        <w:bidi w:val="0"/>
-        <w:rPr>
-          <w:sz w:val="24"/>
-          <w:szCs w:val="24"/>
-        </w:rPr>
-      </w:pPr>
-      <w:r>
-        <w:rPr>
-          <w:sz w:val="24"/>
-          <w:szCs w:val="24"/>
-        </w:rPr>
-        <w:t xml:space="preserve"> Chunk 4 [LLY]: ## LLY - **Domain:** Health - **Risk level:** low - **Outlook:** Leader in diabetes and obesity treatments with strong p...</w:t>
-      </w:r>
-    </w:p>
-    <w:p>
-      <w:pPr>
-        <w:bidi w:val="0"/>
-        <w:rPr>
-          <w:sz w:val="24"/>
-          <w:szCs w:val="24"/>
-          <w:rtl/>
-        </w:rPr>
-      </w:pPr>
-    </w:p>
-    <w:p>
-      <w:pPr>
-        <w:bidi w:val="0"/>
-        <w:rPr>
-          <w:sz w:val="24"/>
-          <w:szCs w:val="24"/>
-        </w:rPr>
-      </w:pPr>
-      <w:r>
-        <w:rPr>
-          <w:sz w:val="24"/>
-          <w:szCs w:val="24"/>
-        </w:rPr>
-        <w:t>--- [Node] LLM Explanation (Grounded Generation) ---</w:t>
-      </w:r>
-    </w:p>
-    <w:p>
-      <w:pPr>
-        <w:bidi w:val="0"/>
-        <w:rPr>
-          <w:sz w:val="24"/>
-          <w:szCs w:val="24"/>
-          <w:rtl/>
-        </w:rPr>
-      </w:pPr>
-    </w:p>
-    <w:p>
-      <w:pPr>
-        <w:bidi w:val="0"/>
-        <w:rPr>
-          <w:sz w:val="24"/>
-          <w:szCs w:val="24"/>
-          <w:rtl/>
-        </w:rPr>
-      </w:pPr>
-      <w:r>
-        <w:rPr>
-          <w:sz w:val="24"/>
-          <w:szCs w:val="24"/>
-        </w:rPr>
-        <w:t>==============================================</w:t>
-      </w:r>
-    </w:p>
-    <w:p>
-      <w:pPr>
-        <w:bidi w:val="0"/>
-        <w:rPr>
-          <w:sz w:val="24"/>
-          <w:szCs w:val="24"/>
-        </w:rPr>
-      </w:pPr>
-      <w:r>
-        <w:rPr>
-          <w:sz w:val="24"/>
-          <w:szCs w:val="24"/>
-        </w:rPr>
-        <w:t xml:space="preserve">               FINAL REPORT                   </w:t>
-      </w:r>
-    </w:p>
-    <w:p>
-      <w:pPr>
-        <w:bidi w:val="0"/>
-        <w:rPr>
-          <w:sz w:val="24"/>
-          <w:szCs w:val="24"/>
-          <w:rtl/>
-        </w:rPr>
-      </w:pPr>
-      <w:r>
-        <w:rPr>
-          <w:sz w:val="24"/>
-          <w:szCs w:val="24"/>
-        </w:rPr>
-        <w:t>==============================================</w:t>
-      </w:r>
-    </w:p>
-    <w:p>
-      <w:pPr>
-        <w:bidi w:val="0"/>
-        <w:rPr>
-          <w:sz w:val="24"/>
-          <w:szCs w:val="24"/>
-        </w:rPr>
-      </w:pPr>
-      <w:r>
-        <w:rPr>
-          <w:sz w:val="24"/>
-          <w:szCs w:val="24"/>
-        </w:rPr>
-        <w:t>Hello! Based on your interest in the health domain with a high-risk tolerance and a medium-term horizon of 2-5 years, I can provide some educational insights from the retrieved information.</w:t>
-      </w:r>
-    </w:p>
-    <w:p>
-      <w:pPr>
-        <w:bidi w:val="0"/>
-        <w:rPr>
-          <w:sz w:val="24"/>
-          <w:szCs w:val="24"/>
-          <w:rtl/>
-        </w:rPr>
-      </w:pPr>
-    </w:p>
-    <w:p>
-      <w:pPr>
-        <w:bidi w:val="0"/>
-        <w:rPr>
-          <w:sz w:val="24"/>
-          <w:szCs w:val="24"/>
-        </w:rPr>
-      </w:pPr>
-      <w:r>
-        <w:rPr>
-          <w:sz w:val="24"/>
-          <w:szCs w:val="24"/>
-        </w:rPr>
-        <w:t>Here is a stock suggestion that aligns with your criteria:</w:t>
-      </w:r>
-    </w:p>
-    <w:p>
-      <w:pPr>
-        <w:bidi w:val="0"/>
-        <w:rPr>
-          <w:sz w:val="24"/>
-          <w:szCs w:val="24"/>
-          <w:rtl/>
-        </w:rPr>
-      </w:pPr>
-    </w:p>
-    <w:p>
-      <w:pPr>
-        <w:bidi w:val="0"/>
-        <w:rPr>
-          <w:sz w:val="24"/>
-          <w:szCs w:val="24"/>
-        </w:rPr>
-      </w:pPr>
-      <w:r>
-        <w:rPr>
-          <w:sz w:val="24"/>
-          <w:szCs w:val="24"/>
-        </w:rPr>
-        <w:t>*   **CRSP**</w:t>
-      </w:r>
-    </w:p>
-    <w:p>
-      <w:pPr>
-        <w:bidi w:val="0"/>
-        <w:rPr>
-          <w:sz w:val="24"/>
-          <w:szCs w:val="24"/>
-        </w:rPr>
-      </w:pPr>
-      <w:r>
-        <w:rPr>
-          <w:sz w:val="24"/>
-          <w:szCs w:val="24"/>
-        </w:rPr>
-        <w:t xml:space="preserve">    CRSP is categorized within the health domain and explicitly noted as having a high risk level, directly matching your preferences. While its outlook highlights "long-term potential" in CRISPR-based therapies, for a high-risk investment in innovative biotechnology, significant developments and market recognition can often occur within a medium 2-5 year investment window. Its key risks, such as clinical uncertainty and a volatile revenue outlook, further reinforce its high-risk profile, aligning with your specified appetite for risk.</w:t>
-      </w:r>
-    </w:p>
-    <w:p>
-      <w:pPr>
-        <w:bidi w:val="0"/>
-        <w:rPr>
-          <w:sz w:val="24"/>
-          <w:szCs w:val="24"/>
-        </w:rPr>
-      </w:pPr>
-      <w:r>
-        <w:rPr>
-          <w:sz w:val="24"/>
-          <w:szCs w:val="24"/>
-        </w:rPr>
-        <w:t>==============================================</w:t>
-      </w:r>
-      <w:r>
-        <w:rPr>
-          <w:sz w:val="24"/>
-          <w:szCs w:val="24"/>
-        </w:rPr>
-        <w:t xml:space="preserve"> </w:t>
-      </w:r>
-    </w:p>
-    <w:p>
-      <w:pPr>
-        <w:bidi w:val="0"/>
-        <w:rPr>
-          <w:sz w:val="24"/>
-          <w:szCs w:val="24"/>
-        </w:rPr>
-      </w:pPr>
-    </w:p>
-    <w:p>
-      <w:pPr>
-        <w:bidi w:val="0"/>
-        <w:rPr>
-          <w:sz w:val="24"/>
-          <w:szCs w:val="24"/>
-        </w:rPr>
-      </w:pPr>
-      <w:r>
-        <w:rPr>
-          <w:sz w:val="24"/>
-          <w:szCs w:val="24"/>
-        </w:rPr>
         <w:br w:type="page"/>
       </w:r>
     </w:p>
@@ -1773,7 +1745,6 @@
       <w:pPr>
         <w:bidi w:val="0"/>
         <w:rPr>
-          <w:rFonts w:hint="cs"/>
           <w:sz w:val="36"/>
           <w:szCs w:val="36"/>
           <w:rtl/>
@@ -2551,6 +2522,7 @@
   <w:style w:type="character" w:default="1" w:styleId="a0">
     <w:name w:val="Default Paragraph Font"/>
     <w:uiPriority w:val="1"/>
+    <w:semiHidden/>
     <w:unhideWhenUsed/>
   </w:style>
   <w:style w:type="table" w:default="1" w:styleId="a1">

</xml_diff>